<commit_message>
auto: XHS cards — 2026-08-22
</commit_message>
<xml_diff>
--- a/docs/xhs/2026-08-21/科技报/发布文案.docx
+++ b/docs/xhs/2026-08-21/科技报/发布文案.docx
@@ -11,7 +11,7 @@
         <w:rPr>
           <w:color w:val="FF3366"/>
         </w:rPr>
-        <w:t>🚨今天AI圈又地震了…第1条80亿封神</w:t>
+        <w:t>🔥 今天AI快讯，第3条直接封神</w:t>
       </w:r>
     </w:p>
     <w:p>
@@ -40,60 +40,40 @@
         <w:spacing w:line="384" w:lineRule="auto"/>
       </w:pPr>
       <w:r>
-        <w:t>今天的AI圈，真的杀疯了。</w:t>
+        <w:t>🚨 今天的AI圈杀疯了！DeepSeek多模态开源，社区高呼「鲸鱼开天眼」，从纯文本到视觉理解生成，开源生态要变天。</w:t>
         <w:br/>
         <w:br/>
-        <w:t>刚看到Stripe以80亿美元收购OpenRouter，直接刷新AI基建赛道纪录。支付巨头下场买模型路由，这不是简单收购，是在赌未来AI调用入口的定价权。OpenRouter独立路线保留，但生态重构不可避免。</w:t>
-        <w:br/>
-        <w:t>💬 锐评：AI界的广场协议，签得漂亮。</w:t>
+        <w:t>⭐ DeepSeek多模态上新 视觉理解+生成双双开挂，开发者迎来高性价比开源视觉方案。💬 开源党扬眉吐气，这波天花板顶高了。</w:t>
         <w:br/>
         <w:br/>
-        <w:t>特斯拉、Uber和Waymo同时获准在内华达州部署最高8000辆Robotaxi。自动驾驶从路测走到规模化商业运营，这一步跨了十年。</w:t>
-        <w:br/>
-        <w:t>💬 锐评：方向盘还没消失，但自动驾驶的牌照已经到手了。</w:t>
+        <w:t>⭐ Meta开源Muse Glimmer 本地部署+Agent+多模态，离线运行+隐私保护双buff。💬 端侧AI要变天，Meta这局赢麻了。</w:t>
         <w:br/>
         <w:br/>
-        <w:t>Meta发布开源多模态模型Muse Glimmer，主打本地化+代理式，能在设备端跑。端侧AI才是Meta的胜负手，开源策略继续挤压闭源空间。</w:t>
-        <w:br/>
-        <w:t>💬 锐评：AI的下一战场不在云端，在你的手机里。</w:t>
+        <w:t>⭐ ChatGPT新增短信读取 AI深挖核心通讯数据，个性化升级但隐私边界成焦点。💬 细思极恐，这权限给得有点大。</w:t>
         <w:br/>
         <w:br/>
-        <w:t>Greg Brockman角色扩大，OpenAI进入所谓“布罗克曼时代”，IPO前夜权力集中。内忧外患之下，一人拍板是效率还是风险？</w:t>
-        <w:br/>
-        <w:t>💬 锐评：OpenAI的航向，越来越依赖一个人了。</w:t>
+        <w:t>⭐ AI会计Rillet 48小时融资1亿美元成独角兽，顶级VC疯抢。💬 资本疯起来，48小时都嫌慢。</w:t>
         <w:br/>
         <w:br/>
-        <w:t>OpenAI企业市场份额正追平Anthropic，但企业客户在两个模型间频繁横跳。市场没有粘性，说明产品差不对决还没结束。</w:t>
-        <w:br/>
-        <w:t>💬 锐评：客户用脚投票，先赢不算赢。</w:t>
+        <w:t>⭐ 苹果裁Siri和Vision Pro团队，AR/VR收缩，转向轻量AI眼镜。💬 早该务实了，别死磕头显。</w:t>
         <w:br/>
         <w:br/>
-        <w:t>NVIDIA发布开源多语言语音模型Magpie TTS，低延迟，可本地部署。语音智能体的成本门槛被打下来一波。</w:t>
-        <w:br/>
-        <w:t>💬 锐评：NVIDIA不只要卖显卡，还要抢语音框架的蛋糕。</w:t>
+        <w:t>⭐ Nvidia研究：智能体框架比模型更重要，微调+工具调用决定成败。💬 模型党别争了，工程才是真爹。</w:t>
         <w:br/>
         <w:br/>
-        <w:t>NVIDIA把实时生成式仿真带进手术机器人，Cosmos-H-Dreams让机器人在虚拟环境里练手。AI医疗迈出关键一步。</w:t>
-        <w:br/>
-        <w:t>💬 锐评：手术机器人从此有了自己的“训练基地”。</w:t>
+        <w:t>⭐ NVIDIA开源Magpie TTS 多语言低延迟语音合成，私有化部署全掌控。💬 端侧语音要起飞，云端垄断凉了。</w:t>
         <w:br/>
         <w:br/>
-        <w:t>AI数据公司Micro1年化收入达到5亿美元。卖数据、做标注的成了AI浪潮里闷声发财的卖铲人。</w:t>
-        <w:br/>
-        <w:t>💬 锐评：淘金热里最稳的，永远是卖铲子的。</w:t>
+        <w:t>⭐ HF夏季开源报告 开源能力边界扩张，推理效率+多模态是主战场。💬 开源部队全速反超，闭源该慌了。</w:t>
         <w:br/>
         <w:br/>
-        <w:t>Google给出版商加了一个“优先来源”按钮，试图对抗AI搜索带来的流量流失。但谁来决定“优质”？默认推荐机制还是被Google拿捏。</w:t>
-        <w:br/>
-        <w:t>💬 锐评：给一点甜头，再拿走更多留量。</w:t>
+        <w:t>⭐ Liquid AI推LFM2.5-DSpark 稀疏激活架构，推理加速最高3.2倍。💬 成本砍下来，落地不再是画饼。</w:t>
         <w:br/>
         <w:br/>
-        <w:t>MiniMax发布视频生成工具MiniMax Design，号称视频模型界的Codex。自然语言直接生成、剪辑视频，专业软件还得靠边站。</w:t>
-        <w:br/>
-        <w:t>💬 锐评：短视频创作者的新外挂上线了。</w:t>
+        <w:t>⭐ 研究：LLM安全对齐以英语为中心，非英语场景防护失效。💬 这个坑不补，AI迟早闯大祸。</w:t>
         <w:br/>
         <w:br/>
-        <w:t>哪条最炸？评论区聊聊 👇</w:t>
+        <w:t>哪条最炸？评论区聊 👇</w:t>
       </w:r>
     </w:p>
     <w:p>
@@ -109,7 +89,7 @@
         <w:rPr>
           <w:color w:val="0088FF"/>
         </w:rPr>
-        <w:t>#AI  #人工智能  #AI快讯  #科技前沿  #每日AI  #ChatGPT  #大模型</w:t>
+        <w:t>#AI  #人工智能  #AI快讯  #科技前沿  #每日AI  #ChatGPT  #大模型  #开源AI</w:t>
       </w:r>
     </w:p>
     <w:p>
@@ -128,7 +108,7 @@
         <w:rPr>
           <w:sz w:val="24"/>
         </w:rPr>
-        <w:t>#1 ★★★★★  Stripe以80亿美元收购AI模型路由平台OpenRouter</w:t>
+        <w:t>#1 ★★★★★  DeepSeek多模态模型上新，开源社区迎来“天眼”时刻</w:t>
       </w:r>
     </w:p>
     <w:p>
@@ -145,7 +125,7 @@
         <w:pStyle w:val="ListBullet"/>
       </w:pPr>
       <w:r>
-        <w:t>支付巨头Stripe以80亿美元完成对AI模型路由平台OpenRouter的收购，并承诺维持其独立产品路线。此次收购将AI基础设施与支付生态深度结合，可能重塑AI模型分发与调用的市场格局，是近年AI领域最重大的并购之一。</w:t>
+        <w:t>DeepSeek发布全新多模态模型，被社区称为“鲸鱼终于开天眼”。该模型在视觉语言理解与生成任务上表现亮眼，标志着DeepSeek从纯文本向多模态能力的关键跨越，有望进一步推动开源多模态生态发展，为全球开发者提供高性价比的视觉AI方案。</w:t>
       </w:r>
     </w:p>
     <w:p>
@@ -154,7 +134,7 @@
           <w:color w:val="3366CC"/>
           <w:sz w:val="18"/>
         </w:rPr>
-        <w:t>https://www.ifanr.com/1675718</w:t>
+        <w:t>https://www.ifanr.com/1676067?utm_source=rss&amp;utm_medium=rss&amp;utm_campaign=</w:t>
       </w:r>
     </w:p>
     <w:p/>
@@ -166,7 +146,7 @@
         <w:rPr>
           <w:sz w:val="24"/>
         </w:rPr>
-        <w:t>#2 ★★★★★  特斯拉、Uber和Waymo获准在内华达州运营数千辆Robotaxi</w:t>
+        <w:t>#2 ★★★★★  Meta开源Muse Glimmer：本地化、Agent化、多模态新模型</w:t>
       </w:r>
     </w:p>
     <w:p>
@@ -175,7 +155,7 @@
           <w:color w:val="888888"/>
           <w:sz w:val="18"/>
         </w:rPr>
-        <w:t>来源: TechCrunch</w:t>
+        <w:t>来源: Hugging Face - Blog</w:t>
       </w:r>
     </w:p>
     <w:p>
@@ -183,45 +163,7 @@
         <w:pStyle w:val="ListBullet"/>
       </w:pPr>
       <w:r>
-        <w:t>内华达州批准特斯拉、Uber和Waymo在未来12个月内部署最多8000辆Robotaxi。这一政策突破为自动驾驶出行服务的大规模商业化扫清了关键监管障碍，标志着自动驾驶行业进入规模化运营新阶段。</w:t>
-      </w:r>
-    </w:p>
-    <w:p>
-      <w:r>
-        <w:rPr>
-          <w:color w:val="3366CC"/>
-          <w:sz w:val="18"/>
-        </w:rPr>
-        <w:t>https://techcrunch.com/2026/08/20/tesla-uber-and-waymo-all-get-the-ok-to-operate-thousands-of-robotaxis-in-nevada/</w:t>
-      </w:r>
-    </w:p>
-    <w:p/>
-    <w:p>
-      <w:pPr>
-        <w:pStyle w:val="Heading3"/>
-      </w:pPr>
-      <w:r>
-        <w:rPr>
-          <w:sz w:val="24"/>
-        </w:rPr>
-        <w:t>#3 ★★★★☆  Meta发布开源多模态AI模型Muse Glimmer</w:t>
-      </w:r>
-    </w:p>
-    <w:p>
-      <w:r>
-        <w:rPr>
-          <w:color w:val="888888"/>
-          <w:sz w:val="18"/>
-        </w:rPr>
-        <w:t>来源: Hugging Face Blog</w:t>
-      </w:r>
-    </w:p>
-    <w:p>
-      <w:pPr>
-        <w:pStyle w:val="ListBullet"/>
-      </w:pPr>
-      <w:r>
-        <w:t>Meta正式发布Muse Glimmer，这是一款本地化、代理式、多模态的开源AI模型，强调可在设备端运行，具备智能体交互与多模态理解能力。该发布延续了Meta在开源AI领域的战略，有望推动端侧AI应用生态发展。</w:t>
+        <w:t>Meta发布Muse Glimmer，一款强调本地部署、具备智能体能力和多模态理解的开源大模型。该模型支持离线运行，并在隐私保护和任务自主执行方面做了深度优化，是Meta在开源AI生态中的重要战略布局，或重塑端侧AI应用开发范式。</w:t>
       </w:r>
     </w:p>
     <w:p>
@@ -242,7 +184,83 @@
         <w:rPr>
           <w:sz w:val="24"/>
         </w:rPr>
-        <w:t>#4 ★★★★☆  Greg Brockman角色扩张，OpenAI进入“布罗克曼时代”</w:t>
+        <w:t>#3 ★★★★☆  ChatGPT新增短信读取能力，AI助手深度集成手机系统</w:t>
+      </w:r>
+    </w:p>
+    <w:p>
+      <w:r>
+        <w:rPr>
+          <w:color w:val="888888"/>
+          <w:sz w:val="18"/>
+        </w:rPr>
+        <w:t>来源: 爱范儿</w:t>
+      </w:r>
+    </w:p>
+    <w:p>
+      <w:pPr>
+        <w:pStyle w:val="ListBullet"/>
+      </w:pPr>
+      <w:r>
+        <w:t>ChatGPT新增功能，可读取用户短信以提供更个性化、更智能的服务。这一更新意味着AI助手开始深入渗透移动设备的核心通讯数据，引发对隐私边界的广泛讨论，同时也给苹果等封闭平台生态带来新的博弈压力。</w:t>
+      </w:r>
+    </w:p>
+    <w:p>
+      <w:r>
+        <w:rPr>
+          <w:color w:val="3366CC"/>
+          <w:sz w:val="18"/>
+        </w:rPr>
+        <w:t>https://www.ifanr.com/1675954?utm_source=rss&amp;utm_medium=rss&amp;utm_campaign=</w:t>
+      </w:r>
+    </w:p>
+    <w:p/>
+    <w:p>
+      <w:pPr>
+        <w:pStyle w:val="Heading3"/>
+      </w:pPr>
+      <w:r>
+        <w:rPr>
+          <w:sz w:val="24"/>
+        </w:rPr>
+        <w:t>#4 ★★★★☆  AI会计公司Rillet 48小时融资1亿美元，跻身独角兽</w:t>
+      </w:r>
+    </w:p>
+    <w:p>
+      <w:r>
+        <w:rPr>
+          <w:color w:val="888888"/>
+          <w:sz w:val="18"/>
+        </w:rPr>
+        <w:t>来源: TechCrunch</w:t>
+      </w:r>
+    </w:p>
+    <w:p>
+      <w:pPr>
+        <w:pStyle w:val="ListBullet"/>
+      </w:pPr>
+      <w:r>
+        <w:t>AI会计初创公司Rillet CEO在董事会会议上展示增长数据后，意外引发Iconiq、Sequoia等机构的抢投热潮，48小时内完成1亿美元融资并晋升独角兽。事件凸显AI垂直应用赛道的资本热度，以及顶级VC对财务自动化方向的强烈信心。</w:t>
+      </w:r>
+    </w:p>
+    <w:p>
+      <w:r>
+        <w:rPr>
+          <w:color w:val="3366CC"/>
+          <w:sz w:val="18"/>
+        </w:rPr>
+        <w:t>https://techcrunch.com/2026/08/21/how-ai-accounting-startup-rillet-raised-100m-and-became-a-unicorn-in-48-hours/</w:t>
+      </w:r>
+    </w:p>
+    <w:p/>
+    <w:p>
+      <w:pPr>
+        <w:pStyle w:val="Heading3"/>
+      </w:pPr>
+      <w:r>
+        <w:rPr>
+          <w:sz w:val="24"/>
+        </w:rPr>
+        <w:t>#5 ★★★★☆  苹果大幅裁减Siri与Vision Pro团队，AI战略转向</w:t>
       </w:r>
     </w:p>
     <w:p>
@@ -259,7 +277,7 @@
         <w:pStyle w:val="ListBullet"/>
       </w:pPr>
       <w:r>
-        <w:t>经历与马斯克的法律纠纷、苹果起诉及模型安全风波后，OpenAI联合创始人Greg Brockman的角色大幅扩展，成为公司IPO前的核心决策者。此次权力集中可能深刻影响OpenAI未来的战略方向与治理结构。</w:t>
+        <w:t>苹果确认在Siri和Vision Pro团队裁员数百人，包括基本关闭Vision Pro游戏团队并缩减沉浸式内容创作团队。此举显示苹果在AR/VR业务上明显收缩，并将资源集中于更实用的AI产品方向，如轻量级AI眼镜和核心助手能力。</w:t>
       </w:r>
     </w:p>
     <w:p>
@@ -268,7 +286,7 @@
           <w:color w:val="3366CC"/>
           <w:sz w:val="18"/>
         </w:rPr>
-        <w:t>https://www.theverge.com/ai-artificial-intelligence/982774/greg-brockman-openai-role-expansion</w:t>
+        <w:t>https://www.theverge.com/tech/983451/apple-layoffs-vision-pro-siri</w:t>
       </w:r>
     </w:p>
     <w:p/>
@@ -280,7 +298,7 @@
         <w:rPr>
           <w:sz w:val="24"/>
         </w:rPr>
-        <w:t>#5 ★★★★☆  新数据显示OpenAI在企业市场正追赶Anthropic</w:t>
+        <w:t>#6 ★★★★☆  Nvidia研究：AI智能体的“缰绳”比模型本身更重要</w:t>
       </w:r>
     </w:p>
     <w:p>
@@ -297,7 +315,7 @@
         <w:pStyle w:val="ListBullet"/>
       </w:pPr>
       <w:r>
-        <w:t>最新市场数据显示，OpenAI在企业用户市场正迅速追赶Anthropic，企业客户在两个实验室之间频繁切换模型。这种高流动性反映出企业AI支出的“粘性”不足，可能给两家公司的投资者带来长远担忧。</w:t>
+        <w:t>Nvidia最新研究表明，AI智能体能否可靠完成任务，更大程度上取决于外部框架（harness）的设计，如微调策略、工具调用流程和上下文管理。即使基础模型能力平平，精心设计的框架也能让其表现稳定，推动业界重新审视AI工程重点。</w:t>
       </w:r>
     </w:p>
     <w:p>
@@ -306,7 +324,7 @@
           <w:color w:val="3366CC"/>
           <w:sz w:val="18"/>
         </w:rPr>
-        <w:t>https://techcrunch.com/2026/08/20/openai-is-gaining-on-anthropic-with-business-users-new-data-indicates/</w:t>
+        <w:t>https://techcrunch.com/2026/08/21/nvidia-just-showed-that-the-harness-not-the-ai-model-is-now-the-real-hero/</w:t>
       </w:r>
     </w:p>
     <w:p/>
@@ -318,7 +336,7 @@
         <w:rPr>
           <w:sz w:val="24"/>
         </w:rPr>
-        <w:t>#6 ★★★★☆  NVIDIA发布开源权重多语言语音模型Magpie TTS</w:t>
+        <w:t>#7 ★★★★☆  NVIDIA发布Magpie TTS开源模型，低延迟多语言语音代理落地</w:t>
       </w:r>
     </w:p>
     <w:p>
@@ -327,7 +345,7 @@
           <w:color w:val="888888"/>
           <w:sz w:val="18"/>
         </w:rPr>
-        <w:t>来源: Hugging Face Blog</w:t>
+        <w:t>来源: Hugging Face - Blog</w:t>
       </w:r>
     </w:p>
     <w:p>
@@ -335,7 +353,7 @@
         <w:pStyle w:val="ListBullet"/>
       </w:pPr>
       <w:r>
-        <w:t>NVIDIA正式推出Magpie TTS，一款开放权重的多语言文本转语音模型，支持低延迟语音智能体构建，并赋予开发者完整的部署控制权。该模型旨在帮助企业快速搭建多语言语音交互应用，推动语音AI的普及。</w:t>
+        <w:t>NVIDIA发布Magpie TTS，一款开放权重、支持多语言的低延迟语音合成模型，开发者可完全控制部署。该模型面向实时语音代理场景，提供高自然度和跨语言能力，降低了对云端语音服务的依赖，推动语音AI向端侧和私有化部署加速演进。</w:t>
       </w:r>
     </w:p>
     <w:p>
@@ -356,7 +374,7 @@
         <w:rPr>
           <w:sz w:val="24"/>
         </w:rPr>
-        <w:t>#7 ★★★★☆  NVIDIA推出手术机器人实时生成式仿真工具Cosmos-H-Dreams</w:t>
+        <w:t>#8 ★★★☆☆  Hugging Face发布2026夏季开源模型生态观察报告</w:t>
       </w:r>
     </w:p>
     <w:p>
@@ -365,7 +383,7 @@
           <w:color w:val="888888"/>
           <w:sz w:val="18"/>
         </w:rPr>
-        <w:t>来源: Hugging Face Blog</w:t>
+        <w:t>来源: Hugging Face - Blog</w:t>
       </w:r>
     </w:p>
     <w:p>
@@ -373,7 +391,7 @@
         <w:pStyle w:val="ListBullet"/>
       </w:pPr>
       <w:r>
-        <w:t>NVIDIA发布Cosmos-H-Dreams，将实时生成式仿真引入手术机器人领域。该工具可加速手术场景的合成与机器人训练，降低对真实数据的依赖，展示了生成式AI在医疗机器人中的广阔应用前景。</w:t>
+        <w:t>Hugging Face发布2026年夏季开源模型状态报告，系统梳理了当前开源大模型的能力边界、性能进展和生态格局，并对标闭源模型指出差距与机遇。报告特别关注推理效率、多模态融合、Agent框架等前沿方向，是了解开源AI现状的重要参考。</w:t>
       </w:r>
     </w:p>
     <w:p>
@@ -382,7 +400,7 @@
           <w:color w:val="3366CC"/>
           <w:sz w:val="18"/>
         </w:rPr>
-        <w:t>https://huggingface.co/blog/nvidia/cosmos-h-dreams</w:t>
+        <w:t>https://huggingface.co/blog/state-of-open-models-summer-2026</w:t>
       </w:r>
     </w:p>
     <w:p/>
@@ -394,7 +412,7 @@
         <w:rPr>
           <w:sz w:val="24"/>
         </w:rPr>
-        <w:t>#8 ★★★☆☆  AI数据公司Micro1年化收入达5亿美元，受益于训练数据热潮</w:t>
+        <w:t>#9 ★★★★☆  Liquid AI推出LFM2.5-DSpark：推理速度最高提升3.2倍</w:t>
       </w:r>
     </w:p>
     <w:p>
@@ -403,7 +421,7 @@
           <w:color w:val="888888"/>
           <w:sz w:val="18"/>
         </w:rPr>
-        <w:t>来源: TechCrunch</w:t>
+        <w:t>来源: Hugging Face - Blog</w:t>
       </w:r>
     </w:p>
     <w:p>
@@ -411,7 +429,7 @@
         <w:pStyle w:val="ListBullet"/>
       </w:pPr>
       <w:r>
-        <w:t>AI数据公司Micro1宣布达到5亿美元的总运行率，得益于全球AI训练数据需求激增。其竞争对手也呈现快速扩张，反映AI数据采集与标注市场进入高速增长期，成为AI产业链中的关键一环。</w:t>
+        <w:t>Liquid AI发布LFM2.5-DSpark模型，通过稀疏激活和高效架构设计实现最高3.2倍的推理加速，显著降低单位Token成本。该技术为大模型在边缘设备、高并发API服务等场景的规模化部署提供了更经济的路径，加速AI应用落地。</w:t>
       </w:r>
     </w:p>
     <w:p>
@@ -420,7 +438,7 @@
           <w:color w:val="3366CC"/>
           <w:sz w:val="18"/>
         </w:rPr>
-        <w:t>https://techcrunch.com/2026/08/20/ai-data-startup-micro1-reaches-500m-gross-run-rate-amid-ai-training-boom/</w:t>
+        <w:t>https://huggingface.co/blog/LiquidAI/lfm25-dspark</w:t>
       </w:r>
     </w:p>
     <w:p/>
@@ -432,7 +450,7 @@
         <w:rPr>
           <w:sz w:val="24"/>
         </w:rPr>
-        <w:t>#9 ★★★☆☆  Google为出版商提供新按钮，应对AI搜索导致的流量损失</w:t>
+        <w:t>#10 ★★★☆☆  研究揭示LLM跨语言安全缺口：安全对齐存在“幻觉”</w:t>
       </w:r>
     </w:p>
     <w:p>
@@ -441,7 +459,7 @@
           <w:color w:val="888888"/>
           <w:sz w:val="18"/>
         </w:rPr>
-        <w:t>来源: TechCrunch</w:t>
+        <w:t>来源: arXiv</w:t>
       </w:r>
     </w:p>
     <w:p>
@@ -449,7 +467,7 @@
         <w:pStyle w:val="ListBullet"/>
       </w:pPr>
       <w:r>
-        <w:t>Google推出一项新功能：读者点击按钮即可将某家出版商设为Search、Discover和Google News的首选来源。此举帮助优质内容方在AI搜索冲击下减少流量下滑，但也引发关于默认推荐机制是否公平的讨论。</w:t>
+        <w:t>最新研究发现，当前大模型的安全对齐训练以英语为中心，导致非英语语言场景下安全防护显著失效，形成跨语言安全缺口。这种“对齐幻觉”对语音助手和多语言对话系统构成直接风险，研究者呼吁构建多语言多维度的安全评测体系。</w:t>
       </w:r>
     </w:p>
     <w:p>
@@ -458,45 +476,7 @@
           <w:color w:val="3366CC"/>
           <w:sz w:val="18"/>
         </w:rPr>
-        <w:t>https://techcrunch.com/2026/08/20/google-gives-publishers-a-new-way-to-fight-ai-driven-traffic-losses/</w:t>
-      </w:r>
-    </w:p>
-    <w:p/>
-    <w:p>
-      <w:pPr>
-        <w:pStyle w:val="Heading3"/>
-      </w:pPr>
-      <w:r>
-        <w:rPr>
-          <w:sz w:val="24"/>
-        </w:rPr>
-        <w:t>#10 ★★★☆☆  MiniMax发布视频模型创作工具MiniMax Design</w:t>
-      </w:r>
-    </w:p>
-    <w:p>
-      <w:r>
-        <w:rPr>
-          <w:color w:val="888888"/>
-          <w:sz w:val="18"/>
-        </w:rPr>
-        <w:t>来源: 爱范儿</w:t>
-      </w:r>
-    </w:p>
-    <w:p>
-      <w:pPr>
-        <w:pStyle w:val="ListBullet"/>
-      </w:pPr>
-      <w:r>
-        <w:t>MiniMax正式推出视频模型设计工具MiniMax Design，被称为“视频模型界的Codex”。该工具支持通过自然语言直接生成、编辑视频，意图取代传统专业创作软件，大幅降低视频制作门槛，引领AI视频创作新范式。</w:t>
-      </w:r>
-    </w:p>
-    <w:p>
-      <w:r>
-        <w:rPr>
-          <w:color w:val="3366CC"/>
-          <w:sz w:val="18"/>
-        </w:rPr>
-        <w:t>https://www.ifanr.com/1675657</w:t>
+        <w:t>https://arxiv.org/abs/2608.18131</w:t>
       </w:r>
     </w:p>
     <w:p/>

</xml_diff>